<commit_message>
refactor: update job roles and responsibilities in pt-BR translation for clarity and impact
</commit_message>
<xml_diff>
--- a/src/assets/vinicius_costa_cv.docx
+++ b/src/assets/vinicius_costa_cv.docx
@@ -4,29 +4,13 @@
   <w:body>
     <w:p>
       <w:pPr>
-        <w:pStyle w:val="Title"/>
-        <w:pageBreakBefore w:val="0"/>
-        <w:pBdr>
-          <w:top w:space="0" w:sz="0" w:val="nil"/>
-          <w:left w:space="0" w:sz="0" w:val="nil"/>
-          <w:bottom w:space="0" w:sz="0" w:val="nil"/>
-          <w:right w:space="0" w:sz="0" w:val="nil"/>
-          <w:between w:space="0" w:sz="0" w:val="nil"/>
-        </w:pBdr>
-        <w:shd w:fill="auto" w:val="clear"/>
-        <w:rPr>
-          <w:b w:val="1"/>
-          <w:bCs w:val="1"/>
-          <w:color w:val="c18c5d"/>
-        </w:rPr>
+        <w:pStyle w:val="Heading1"/>
+        <w:rPr/>
       </w:pPr>
       <w:bookmarkStart w:colFirst="0" w:colLast="0" w:name="_5x0d5h95i329" w:id="0"/>
       <w:bookmarkEnd w:id="0"/>
       <w:r>
         <w:rPr>
-          <w:b w:val="1"/>
-          <w:bCs w:val="1"/>
-          <w:color w:val="c18c5d"/>
           <w:rtl w:val="0"/>
         </w:rPr>
         <w:t xml:space="preserve">VINÍCIUS COSTA</w:t>
@@ -79,6 +63,7 @@
           <w:between w:space="0" w:sz="0" w:val="nil"/>
         </w:pBdr>
         <w:shd w:fill="auto" w:val="clear"/>
+        <w:spacing w:after="0" w:before="0" w:line="276" w:lineRule="auto"/>
         <w:ind w:left="0" w:firstLine="0"/>
         <w:jc w:val="left"/>
         <w:rPr>
@@ -94,16 +79,6 @@
           <v:rect style="width:0.0pt;height:1.5pt" o:hr="t" o:hrstd="t" o:hralign="center" fillcolor="#A0A0A0" stroked="f"/>
         </w:pict>
       </w:r>
-      <w:r>
-        <w:rPr>
-          <w:rtl w:val="0"/>
-        </w:rPr>
-      </w:r>
-    </w:p>
-    <w:p>
-      <w:pPr>
-        <w:rPr/>
-      </w:pPr>
       <w:r>
         <w:rPr>
           <w:rtl w:val="0"/>
@@ -121,7 +96,7 @@
           <w:between w:space="0" w:sz="0" w:val="nil"/>
         </w:pBdr>
         <w:shd w:fill="auto" w:val="clear"/>
-        <w:spacing w:before="0" w:line="276" w:lineRule="auto"/>
+        <w:spacing w:after="0" w:before="0" w:line="276" w:lineRule="auto"/>
         <w:rPr>
           <w:rFonts w:ascii="Proxima Nova" w:cs="Proxima Nova" w:eastAsia="Proxima Nova" w:hAnsi="Proxima Nova"/>
           <w:color w:val="666666"/>
@@ -176,7 +151,7 @@
           <w:between w:space="0" w:sz="0" w:val="nil"/>
         </w:pBdr>
         <w:shd w:fill="auto" w:val="clear"/>
-        <w:spacing w:before="0" w:line="276" w:lineRule="auto"/>
+        <w:spacing w:after="0" w:before="0" w:line="276" w:lineRule="auto"/>
         <w:rPr>
           <w:sz w:val="24"/>
           <w:szCs w:val="24"/>
@@ -288,7 +263,7 @@
           <w:between w:space="0" w:sz="0" w:val="nil"/>
         </w:pBdr>
         <w:shd w:fill="auto" w:val="clear"/>
-        <w:spacing w:before="0" w:line="240" w:lineRule="auto"/>
+        <w:spacing w:after="0" w:before="0" w:line="276" w:lineRule="auto"/>
         <w:rPr>
           <w:color w:val="666666"/>
           <w:sz w:val="24"/>
@@ -308,43 +283,22 @@
     </w:p>
     <w:p>
       <w:pPr>
-        <w:pStyle w:val="Heading1"/>
-        <w:pageBreakBefore w:val="0"/>
-        <w:pBdr>
-          <w:top w:space="0" w:sz="0" w:val="nil"/>
-          <w:left w:space="0" w:sz="0" w:val="nil"/>
-          <w:bottom w:space="0" w:sz="0" w:val="nil"/>
-          <w:right w:space="0" w:sz="0" w:val="nil"/>
-          <w:between w:space="0" w:sz="0" w:val="nil"/>
-        </w:pBdr>
-        <w:shd w:fill="auto" w:val="clear"/>
+        <w:pStyle w:val="Heading2"/>
         <w:spacing w:before="200" w:lineRule="auto"/>
-        <w:rPr>
-          <w:color w:val="c18c5d"/>
-          <w:sz w:val="30"/>
-          <w:szCs w:val="30"/>
-        </w:rPr>
+        <w:rPr/>
       </w:pPr>
       <w:bookmarkStart w:colFirst="0" w:colLast="0" w:name="_inx73jfg7qti" w:id="3"/>
       <w:bookmarkEnd w:id="3"/>
       <w:r>
         <w:rPr>
-          <w:color w:val="c18c5d"/>
-          <w:sz w:val="30"/>
-          <w:szCs w:val="30"/>
-          <w:rtl w:val="0"/>
-        </w:rPr>
-        <w:t xml:space="preserve">RESUMO PROFISSIONAL</w:t>
-      </w:r>
-      <w:r>
-        <w:rPr>
-          <w:rtl w:val="0"/>
-        </w:rPr>
-      </w:r>
-    </w:p>
-    <w:p>
-      <w:pPr>
-        <w:spacing w:after="240" w:before="240" w:lineRule="auto"/>
+          <w:rtl w:val="0"/>
+        </w:rPr>
+        <w:t xml:space="preserve">RESUMO</w:t>
+      </w:r>
+    </w:p>
+    <w:p>
+      <w:pPr>
+        <w:spacing w:after="0" w:before="240" w:line="276" w:lineRule="auto"/>
         <w:jc w:val="both"/>
         <w:rPr/>
       </w:pPr>
@@ -352,7 +306,7 @@
         <w:rPr>
           <w:rtl w:val="0"/>
         </w:rPr>
-        <w:t xml:space="preserve">Desenvolvedor Front-End com sólida experiência na construção e evolução de aplicações web escaláveis, acessíveis e de alta performance. Especialista nos ecossistemas React, TypeScript e Next.js, com forte atuação no desenvolvimento de plataformas SaaS B2B, arquitetura de Design Systems e criação de testes automatizados (Jest e React Testing Library). Possuo vivência prática em otimização de infraestrutura (AWS), implementação de métricas de produto (Mixpanel) e integração de APIs RESTful. Focado em colaborar com equipes multidisciplinares através de metodologias ágeis para entregar soluções robustas que geram impacto direto no negócio.</w:t>
+        <w:t xml:space="preserve">Desenvolvedor Front-End com sólida experiência na construção e evolução de aplicações web escaláveis, acessíveis e de alta performance. Especialista nos ecossistemas React, TypeScript e Next.js, com forte atuação no desenvolvimento de plataformas SaaS B2B, arquitetura de Design Systems e criação de testes automatizados (Jest e React Testing Library). Possuo vivência prática em otimização de infraestrutura (AWS), implementação de métricas de produto (Mixpanel) e integração de APIs REST. Focado em colaborar com equipes multidisciplinares através de metodologias ágeis para entregar soluções robustas que geram impacto direto no negócio.</w:t>
       </w:r>
       <w:r>
         <w:rPr>
@@ -380,79 +334,33 @@
     </w:p>
     <w:p>
       <w:pPr>
-        <w:pStyle w:val="Heading1"/>
-        <w:keepNext w:val="0"/>
-        <w:keepLines w:val="0"/>
-        <w:pageBreakBefore w:val="0"/>
-        <w:pBdr>
-          <w:top w:space="0" w:sz="0" w:val="nil"/>
-          <w:left w:space="0" w:sz="0" w:val="nil"/>
-          <w:bottom w:space="0" w:sz="0" w:val="nil"/>
-          <w:right w:space="0" w:sz="0" w:val="nil"/>
-          <w:between w:space="0" w:sz="0" w:val="nil"/>
-        </w:pBdr>
-        <w:shd w:fill="auto" w:val="clear"/>
-        <w:spacing w:after="200" w:before="200" w:line="240" w:lineRule="auto"/>
-        <w:rPr>
-          <w:rFonts w:ascii="Proxima Nova" w:cs="Proxima Nova" w:eastAsia="Proxima Nova" w:hAnsi="Proxima Nova"/>
-          <w:b w:val="1"/>
-          <w:bCs w:val="1"/>
-          <w:color w:val="c18c5d"/>
-          <w:sz w:val="30"/>
-          <w:szCs w:val="30"/>
-        </w:rPr>
-      </w:pPr>
-      <w:bookmarkStart w:colFirst="0" w:colLast="0" w:name="_d0a6vx6wr992" w:id="4"/>
-      <w:bookmarkEnd w:id="4"/>
-      <w:r>
-        <w:rPr>
-          <w:color w:val="c18c5d"/>
-          <w:sz w:val="30"/>
-          <w:szCs w:val="30"/>
-          <w:rtl w:val="0"/>
-        </w:rPr>
-        <w:t xml:space="preserve">EXPERIÊNCIA PROFISSIONAL</w:t>
-      </w:r>
-      <w:r>
-        <w:rPr>
-          <w:rtl w:val="0"/>
-        </w:rPr>
-      </w:r>
-    </w:p>
-    <w:p>
-      <w:pPr>
         <w:pStyle w:val="Heading2"/>
         <w:keepNext w:val="0"/>
         <w:keepLines w:val="0"/>
-        <w:pageBreakBefore w:val="0"/>
-        <w:pBdr>
-          <w:top w:space="0" w:sz="0" w:val="nil"/>
-          <w:left w:space="0" w:sz="0" w:val="nil"/>
-          <w:bottom w:space="0" w:sz="0" w:val="nil"/>
-          <w:right w:space="0" w:sz="0" w:val="nil"/>
-          <w:between w:space="0" w:sz="0" w:val="nil"/>
-        </w:pBdr>
-        <w:shd w:fill="auto" w:val="clear"/>
-        <w:spacing w:line="240" w:lineRule="auto"/>
-        <w:rPr>
-          <w:color w:val="666666"/>
-          <w:sz w:val="20"/>
-          <w:szCs w:val="20"/>
-        </w:rPr>
+        <w:spacing w:before="200" w:lineRule="auto"/>
+        <w:rPr/>
+      </w:pPr>
+      <w:bookmarkStart w:colFirst="0" w:colLast="0" w:name="_d0a6vx6wr992" w:id="4"/>
+      <w:bookmarkEnd w:id="4"/>
+      <w:r>
+        <w:rPr>
+          <w:rtl w:val="0"/>
+        </w:rPr>
+        <w:t xml:space="preserve">EXPERIÊNCIA</w:t>
+      </w:r>
+    </w:p>
+    <w:p>
+      <w:pPr>
+        <w:pStyle w:val="Heading3"/>
+        <w:rPr/>
       </w:pPr>
       <w:bookmarkStart w:colFirst="0" w:colLast="0" w:name="_mu43qcboozqe" w:id="5"/>
       <w:bookmarkEnd w:id="5"/>
       <w:r>
         <w:rPr>
-          <w:color w:val="000000"/>
-          <w:rtl w:val="0"/>
-        </w:rPr>
-        <w:t xml:space="preserve">Sympla</w:t>
-      </w:r>
-      <w:r>
-        <w:rPr>
-          <w:rtl w:val="0"/>
-        </w:rPr>
+          <w:rtl w:val="0"/>
+        </w:rPr>
+        <w:t xml:space="preserve">Desenvolvedor de Front-end Pleno</w:t>
       </w:r>
     </w:p>
     <w:tbl>
@@ -476,7 +384,304 @@
       <w:tr>
         <w:trPr>
           <w:cantSplit w:val="1"/>
-          <w:trHeight w:val="566.9291338582677" w:hRule="atLeast"/>
+          <w:tblHeader w:val="0"/>
+        </w:trPr>
+        <w:tc>
+          <w:tcPr>
+            <w:shd w:fill="auto" w:val="clear"/>
+            <w:tcMar>
+              <w:top w:w="0.0" w:type="dxa"/>
+              <w:left w:w="0.0" w:type="dxa"/>
+              <w:bottom w:w="0.0" w:type="dxa"/>
+              <w:right w:w="0.0" w:type="dxa"/>
+            </w:tcMar>
+            <w:vAlign w:val="center"/>
+          </w:tcPr>
+          <w:p>
+            <w:pPr>
+              <w:spacing w:before="0" w:line="240" w:lineRule="auto"/>
+              <w:rPr>
+                <w:color w:val="666666"/>
+              </w:rPr>
+            </w:pPr>
+            <w:r>
+              <w:rPr>
+                <w:color w:val="666666"/>
+                <w:rtl w:val="0"/>
+              </w:rPr>
+              <w:t xml:space="preserve">Sympla</w:t>
+            </w:r>
+          </w:p>
+        </w:tc>
+        <w:tc>
+          <w:tcPr>
+            <w:shd w:fill="auto" w:val="clear"/>
+            <w:tcMar>
+              <w:top w:w="0.0" w:type="dxa"/>
+              <w:left w:w="0.0" w:type="dxa"/>
+              <w:bottom w:w="0.0" w:type="dxa"/>
+              <w:right w:w="0.0" w:type="dxa"/>
+            </w:tcMar>
+            <w:vAlign w:val="center"/>
+          </w:tcPr>
+          <w:p>
+            <w:pPr>
+              <w:pStyle w:val="Heading4"/>
+              <w:spacing w:before="0" w:line="240" w:lineRule="auto"/>
+              <w:jc w:val="right"/>
+              <w:rPr/>
+            </w:pPr>
+            <w:bookmarkStart w:colFirst="0" w:colLast="0" w:name="_jyssthgjxgm1" w:id="6"/>
+            <w:bookmarkEnd w:id="6"/>
+            <w:r>
+              <w:rPr>
+                <w:rtl w:val="0"/>
+              </w:rPr>
+              <w:t xml:space="preserve">NOV 2025 — JUN 2026</w:t>
+            </w:r>
+          </w:p>
+        </w:tc>
+      </w:tr>
+    </w:tbl>
+    <w:p>
+      <w:pPr>
+        <w:pageBreakBefore w:val="0"/>
+        <w:numPr>
+          <w:ilvl w:val="0"/>
+          <w:numId w:val="1"/>
+        </w:numPr>
+        <w:pBdr>
+          <w:top w:space="0" w:sz="0" w:val="nil"/>
+          <w:left w:space="0" w:sz="0" w:val="nil"/>
+          <w:bottom w:space="0" w:sz="0" w:val="nil"/>
+          <w:right w:space="0" w:sz="0" w:val="nil"/>
+          <w:between w:space="0" w:sz="0" w:val="nil"/>
+        </w:pBdr>
+        <w:shd w:fill="auto" w:val="clear"/>
+        <w:spacing w:after="0" w:afterAutospacing="0" w:before="200" w:line="240" w:lineRule="auto"/>
+        <w:ind w:left="720" w:hanging="360"/>
+        <w:jc w:val="both"/>
+        <w:rPr>
+          <w:highlight w:val="white"/>
+          <w:u w:val="none"/>
+        </w:rPr>
+      </w:pPr>
+      <w:r>
+        <w:rPr>
+          <w:rtl w:val="0"/>
+        </w:rPr>
+        <w:t xml:space="preserve">Liderei o desenvolvimento e a manutenção da plataforma de ingressos com React, Next.js e TypeScript, otimizando a performance e a experiência do usuário na jornada de compra.</w:t>
+      </w:r>
+    </w:p>
+    <w:p>
+      <w:pPr>
+        <w:pageBreakBefore w:val="0"/>
+        <w:numPr>
+          <w:ilvl w:val="0"/>
+          <w:numId w:val="1"/>
+        </w:numPr>
+        <w:pBdr>
+          <w:top w:space="0" w:sz="0" w:val="nil"/>
+          <w:left w:space="0" w:sz="0" w:val="nil"/>
+          <w:bottom w:space="0" w:sz="0" w:val="nil"/>
+          <w:right w:space="0" w:sz="0" w:val="nil"/>
+          <w:between w:space="0" w:sz="0" w:val="nil"/>
+        </w:pBdr>
+        <w:shd w:fill="auto" w:val="clear"/>
+        <w:spacing w:after="0" w:afterAutospacing="0" w:before="0" w:beforeAutospacing="0" w:line="240" w:lineRule="auto"/>
+        <w:ind w:left="720" w:hanging="360"/>
+        <w:jc w:val="both"/>
+        <w:rPr>
+          <w:u w:val="none"/>
+        </w:rPr>
+      </w:pPr>
+      <w:r>
+        <w:rPr>
+          <w:rtl w:val="0"/>
+        </w:rPr>
+        <w:t xml:space="preserve">Estruturei o tracking de analytics via Mixpanel em 5 aplicações, mapeando 100+ eventos para análise de comportamento, o que impulsionou o uso da plataforma em 400%.</w:t>
+      </w:r>
+    </w:p>
+    <w:p>
+      <w:pPr>
+        <w:pageBreakBefore w:val="0"/>
+        <w:numPr>
+          <w:ilvl w:val="0"/>
+          <w:numId w:val="1"/>
+        </w:numPr>
+        <w:pBdr>
+          <w:top w:space="0" w:sz="0" w:val="nil"/>
+          <w:left w:space="0" w:sz="0" w:val="nil"/>
+          <w:bottom w:space="0" w:sz="0" w:val="nil"/>
+          <w:right w:space="0" w:sz="0" w:val="nil"/>
+          <w:between w:space="0" w:sz="0" w:val="nil"/>
+        </w:pBdr>
+        <w:shd w:fill="auto" w:val="clear"/>
+        <w:spacing w:after="0" w:afterAutospacing="0" w:before="0" w:beforeAutospacing="0" w:line="240" w:lineRule="auto"/>
+        <w:ind w:left="720" w:hanging="360"/>
+        <w:jc w:val="both"/>
+        <w:rPr>
+          <w:u w:val="none"/>
+        </w:rPr>
+      </w:pPr>
+      <w:r>
+        <w:rPr>
+          <w:rtl w:val="0"/>
+        </w:rPr>
+        <w:t xml:space="preserve">Gerenciei a migração arquitetural do AWS Redshift para o AWS Athena, reduzindo custos de infraestrutura através de scripts de equiparação e controle de rollout via feature flags.</w:t>
+      </w:r>
+    </w:p>
+    <w:p>
+      <w:pPr>
+        <w:pageBreakBefore w:val="0"/>
+        <w:numPr>
+          <w:ilvl w:val="0"/>
+          <w:numId w:val="1"/>
+        </w:numPr>
+        <w:pBdr>
+          <w:top w:space="0" w:sz="0" w:val="nil"/>
+          <w:left w:space="0" w:sz="0" w:val="nil"/>
+          <w:bottom w:space="0" w:sz="0" w:val="nil"/>
+          <w:right w:space="0" w:sz="0" w:val="nil"/>
+          <w:between w:space="0" w:sz="0" w:val="nil"/>
+        </w:pBdr>
+        <w:shd w:fill="auto" w:val="clear"/>
+        <w:spacing w:after="0" w:afterAutospacing="0" w:before="0" w:beforeAutospacing="0" w:line="240" w:lineRule="auto"/>
+        <w:ind w:left="720" w:hanging="360"/>
+        <w:jc w:val="both"/>
+        <w:rPr>
+          <w:u w:val="none"/>
+        </w:rPr>
+      </w:pPr>
+      <w:r>
+        <w:rPr>
+          <w:rtl w:val="0"/>
+        </w:rPr>
+        <w:t xml:space="preserve">Desenvolvi um sistema de notificações push customizadas com Braze SDK e Service Workers, garantindo alta confiabilidade por meio de testes unitários </w:t>
+      </w:r>
+      <w:r>
+        <w:rPr>
+          <w:rtl w:val="0"/>
+        </w:rPr>
+        <w:t xml:space="preserve">com Jest</w:t>
+      </w:r>
+      <w:r>
+        <w:rPr>
+          <w:rtl w:val="0"/>
+        </w:rPr>
+        <w:t xml:space="preserve">.</w:t>
+      </w:r>
+    </w:p>
+    <w:p>
+      <w:pPr>
+        <w:pageBreakBefore w:val="0"/>
+        <w:numPr>
+          <w:ilvl w:val="0"/>
+          <w:numId w:val="1"/>
+        </w:numPr>
+        <w:pBdr>
+          <w:top w:space="0" w:sz="0" w:val="nil"/>
+          <w:left w:space="0" w:sz="0" w:val="nil"/>
+          <w:bottom w:space="0" w:sz="0" w:val="nil"/>
+          <w:right w:space="0" w:sz="0" w:val="nil"/>
+          <w:between w:space="0" w:sz="0" w:val="nil"/>
+        </w:pBdr>
+        <w:shd w:fill="auto" w:val="clear"/>
+        <w:spacing w:before="0" w:beforeAutospacing="0" w:line="240" w:lineRule="auto"/>
+        <w:ind w:left="720" w:hanging="360"/>
+        <w:jc w:val="both"/>
+        <w:rPr>
+          <w:u w:val="none"/>
+        </w:rPr>
+      </w:pPr>
+      <w:r>
+        <w:rPr>
+          <w:rtl w:val="0"/>
+        </w:rPr>
+        <w:t xml:space="preserve">Padronizei o fluxo de publicação de pacotes npm privados no GitLab Registry, promovendo a reutilização eficiente de bibliotecas e acelerando o desenvolvimento entre times.</w:t>
+      </w:r>
+      <w:r>
+        <w:rPr>
+          <w:rtl w:val="0"/>
+        </w:rPr>
+      </w:r>
+    </w:p>
+    <w:p>
+      <w:pPr>
+        <w:pageBreakBefore w:val="0"/>
+        <w:pBdr>
+          <w:top w:space="0" w:sz="0" w:val="nil"/>
+          <w:left w:space="0" w:sz="0" w:val="nil"/>
+          <w:bottom w:space="0" w:sz="0" w:val="nil"/>
+          <w:right w:space="0" w:sz="0" w:val="nil"/>
+          <w:between w:space="0" w:sz="0" w:val="nil"/>
+        </w:pBdr>
+        <w:shd w:fill="auto" w:val="clear"/>
+        <w:spacing w:before="80" w:line="240" w:lineRule="auto"/>
+        <w:ind w:left="0" w:firstLine="0"/>
+        <w:jc w:val="both"/>
+        <w:rPr/>
+      </w:pPr>
+      <w:r>
+        <w:rPr>
+          <w:b w:val="1"/>
+          <w:bCs w:val="1"/>
+          <w:rtl w:val="0"/>
+        </w:rPr>
+        <w:t xml:space="preserve">Tech Stack</w:t>
+      </w:r>
+      <w:r>
+        <w:rPr>
+          <w:rtl w:val="0"/>
+        </w:rPr>
+        <w:t xml:space="preserve">: React, Next.js, TypeScript, Mixpanel, AWS Redshift, AWS Athena, Braze SDK, Service Workers, Jest, npm, GitLab Registry, Markdown, IA (Copilot, Claude).</w:t>
+      </w:r>
+      <w:r>
+        <w:br w:type="page"/>
+      </w:r>
+      <w:r>
+        <w:rPr>
+          <w:rtl w:val="0"/>
+        </w:rPr>
+      </w:r>
+    </w:p>
+    <w:p>
+      <w:pPr>
+        <w:pStyle w:val="Heading3"/>
+        <w:keepNext w:val="0"/>
+        <w:keepLines w:val="0"/>
+        <w:rPr/>
+      </w:pPr>
+      <w:bookmarkStart w:colFirst="0" w:colLast="0" w:name="_em3nacji519j" w:id="7"/>
+      <w:bookmarkEnd w:id="7"/>
+      <w:r>
+        <w:rPr>
+          <w:rtl w:val="0"/>
+        </w:rPr>
+        <w:t xml:space="preserve">Desenvolvedor de Front-end Júnior</w:t>
+      </w:r>
+    </w:p>
+    <w:tbl>
+      <w:tblPr>
+        <w:tblStyle w:val="Table2"/>
+        <w:tblW w:w="9480.0" w:type="dxa"/>
+        <w:jc w:val="left"/>
+        <w:tblLayout w:type="fixed"/>
+        <w:tblLook w:val="0600"/>
+      </w:tblPr>
+      <w:tblGrid>
+        <w:gridCol w:w="4740"/>
+        <w:gridCol w:w="4740"/>
+        <w:tblGridChange w:id="0">
+          <w:tblGrid>
+            <w:gridCol w:w="4740"/>
+            <w:gridCol w:w="4740"/>
+          </w:tblGrid>
+        </w:tblGridChange>
+      </w:tblGrid>
+      <w:tr>
+        <w:trPr>
+          <w:cantSplit w:val="1"/>
           <w:tblHeader w:val="0"/>
         </w:trPr>
         <w:tc>
@@ -502,7 +707,7 @@
                 <w:color w:val="666666"/>
                 <w:rtl w:val="0"/>
               </w:rPr>
-              <w:t xml:space="preserve">Desenvolvedor de Front-end</w:t>
+              <w:t xml:space="preserve">InfoPrice</w:t>
             </w:r>
           </w:p>
         </w:tc>
@@ -519,22 +724,18 @@
           </w:tcPr>
           <w:p>
             <w:pPr>
+              <w:pStyle w:val="Heading4"/>
               <w:spacing w:line="240" w:lineRule="auto"/>
               <w:jc w:val="right"/>
-              <w:rPr>
-                <w:color w:val="666666"/>
-                <w:sz w:val="20"/>
-                <w:szCs w:val="20"/>
-              </w:rPr>
+              <w:rPr/>
             </w:pPr>
+            <w:bookmarkStart w:colFirst="0" w:colLast="0" w:name="_lkw3vf1ak88c" w:id="8"/>
+            <w:bookmarkEnd w:id="8"/>
             <w:r>
               <w:rPr>
-                <w:color w:val="666666"/>
-                <w:sz w:val="20"/>
-                <w:szCs w:val="20"/>
                 <w:rtl w:val="0"/>
               </w:rPr>
-              <w:t xml:space="preserve">NOVEMBRO DE 2025 — JUNHO DE 2026</w:t>
+              <w:t xml:space="preserve">JUN 2023 — OUT 2025</w:t>
             </w:r>
           </w:p>
         </w:tc>
@@ -542,54 +743,30 @@
     </w:tbl>
     <w:p>
       <w:pPr>
-        <w:pageBreakBefore w:val="0"/>
         <w:numPr>
           <w:ilvl w:val="0"/>
           <w:numId w:val="1"/>
         </w:numPr>
-        <w:pBdr>
-          <w:top w:space="0" w:sz="0" w:val="nil"/>
-          <w:left w:space="0" w:sz="0" w:val="nil"/>
-          <w:bottom w:space="0" w:sz="0" w:val="nil"/>
-          <w:right w:space="0" w:sz="0" w:val="nil"/>
-          <w:between w:space="0" w:sz="0" w:val="nil"/>
-        </w:pBdr>
-        <w:shd w:fill="auto" w:val="clear"/>
-        <w:spacing w:after="0" w:afterAutospacing="0" w:before="80" w:line="240" w:lineRule="auto"/>
+        <w:spacing w:after="0" w:afterAutospacing="0" w:before="200" w:line="240" w:lineRule="auto"/>
         <w:ind w:left="720" w:hanging="360"/>
         <w:jc w:val="both"/>
         <w:rPr>
           <w:highlight w:val="white"/>
-          <w:u w:val="none"/>
-        </w:rPr>
-      </w:pPr>
-      <w:r>
-        <w:rPr>
-          <w:rtl w:val="0"/>
-        </w:rPr>
-        <w:t xml:space="preserve">Desenvolvi e mantive aplicações da plataforma de ingressos utilizando React, Next.js e TypeScript, com foco em performance, tipagem e experiência na jornada de compra.</w:t>
-      </w:r>
-      <w:r>
-        <w:rPr>
-          <w:rtl w:val="0"/>
-        </w:rPr>
-      </w:r>
-    </w:p>
-    <w:p>
-      <w:pPr>
-        <w:pageBreakBefore w:val="0"/>
+        </w:rPr>
+      </w:pPr>
+      <w:r>
+        <w:rPr>
+          <w:rtl w:val="0"/>
+        </w:rPr>
+        <w:t xml:space="preserve">Liderei a evolução do front-end de uma plataforma SaaS B2B de precificação para 27.000 lojas, utilizando React, TypeScript e Redux para garantir escalabilidade e performance.</w:t>
+      </w:r>
+    </w:p>
+    <w:p>
+      <w:pPr>
         <w:numPr>
           <w:ilvl w:val="0"/>
           <w:numId w:val="1"/>
         </w:numPr>
-        <w:pBdr>
-          <w:top w:space="0" w:sz="0" w:val="nil"/>
-          <w:left w:space="0" w:sz="0" w:val="nil"/>
-          <w:bottom w:space="0" w:sz="0" w:val="nil"/>
-          <w:right w:space="0" w:sz="0" w:val="nil"/>
-          <w:between w:space="0" w:sz="0" w:val="nil"/>
-        </w:pBdr>
-        <w:shd w:fill="auto" w:val="clear"/>
         <w:spacing w:after="0" w:afterAutospacing="0" w:before="0" w:beforeAutospacing="0" w:line="240" w:lineRule="auto"/>
         <w:ind w:left="720" w:hanging="360"/>
         <w:jc w:val="both"/>
@@ -601,24 +778,15 @@
         <w:rPr>
           <w:rtl w:val="0"/>
         </w:rPr>
-        <w:t xml:space="preserve">Implementei tracking de analytics com Mixpanel em 5 aplicações, estruturando 100+ eventos para análise do comportamento dos usuários e acompanhamento da jornada de compra, contribuindo para um aumento de 400% no uso da plataforma.</w:t>
-      </w:r>
-    </w:p>
-    <w:p>
-      <w:pPr>
-        <w:pageBreakBefore w:val="0"/>
+        <w:t xml:space="preserve">Otimizei o ciclo de desenvolvimento em 30% ao padronizar componentes no Design System com SASS e LESS, assegurando consistência visual e alta reutilização de código.</w:t>
+      </w:r>
+    </w:p>
+    <w:p>
+      <w:pPr>
         <w:numPr>
           <w:ilvl w:val="0"/>
           <w:numId w:val="1"/>
         </w:numPr>
-        <w:pBdr>
-          <w:top w:space="0" w:sz="0" w:val="nil"/>
-          <w:left w:space="0" w:sz="0" w:val="nil"/>
-          <w:bottom w:space="0" w:sz="0" w:val="nil"/>
-          <w:right w:space="0" w:sz="0" w:val="nil"/>
-          <w:between w:space="0" w:sz="0" w:val="nil"/>
-        </w:pBdr>
-        <w:shd w:fill="auto" w:val="clear"/>
         <w:spacing w:after="0" w:afterAutospacing="0" w:before="0" w:beforeAutospacing="0" w:line="240" w:lineRule="auto"/>
         <w:ind w:left="720" w:hanging="360"/>
         <w:jc w:val="both"/>
@@ -630,88 +798,15 @@
         <w:rPr>
           <w:rtl w:val="0"/>
         </w:rPr>
-        <w:t xml:space="preserve">Conduzi</w:t>
-      </w:r>
-      <w:r>
-        <w:rPr>
-          <w:rtl w:val="0"/>
-        </w:rPr>
-        <w:t xml:space="preserve"> a migração arquitetural do banco de dados analítico do AWS Redshift para o AWS Athena, criando scripts de equiparação de dados e controlando o rollout via feature flags, reduzindo significativamente os custos de infraestrutura.</w:t>
-      </w:r>
-    </w:p>
-    <w:p>
-      <w:pPr>
-        <w:pageBreakBefore w:val="0"/>
+        <w:t xml:space="preserve">Mitiguei 40% dos bugs em produção ao implementar testes automatizados com Jest e React Testing Library, alcançando 80% de cobertura em fluxos críticos de negócio.</w:t>
+      </w:r>
+    </w:p>
+    <w:p>
+      <w:pPr>
         <w:numPr>
           <w:ilvl w:val="0"/>
           <w:numId w:val="1"/>
         </w:numPr>
-        <w:pBdr>
-          <w:top w:space="0" w:sz="0" w:val="nil"/>
-          <w:left w:space="0" w:sz="0" w:val="nil"/>
-          <w:bottom w:space="0" w:sz="0" w:val="nil"/>
-          <w:right w:space="0" w:sz="0" w:val="nil"/>
-          <w:between w:space="0" w:sz="0" w:val="nil"/>
-        </w:pBdr>
-        <w:shd w:fill="auto" w:val="clear"/>
-        <w:spacing w:after="0" w:afterAutospacing="0" w:before="0" w:beforeAutospacing="0" w:line="240" w:lineRule="auto"/>
-        <w:ind w:left="720" w:hanging="360"/>
-        <w:jc w:val="both"/>
-        <w:rPr>
-          <w:u w:val="none"/>
-        </w:rPr>
-      </w:pPr>
-      <w:r>
-        <w:rPr>
-          <w:rtl w:val="0"/>
-        </w:rPr>
-        <w:t xml:space="preserve">Desenvolvi um sistema de notificações push customizadas integrando o SDK da Braze com Service Workers, gerenciando as lógicas de background e foreground, com confiabilidade garantida por testes unitários no Jest.</w:t>
-      </w:r>
-    </w:p>
-    <w:p>
-      <w:pPr>
-        <w:pageBreakBefore w:val="0"/>
-        <w:numPr>
-          <w:ilvl w:val="0"/>
-          <w:numId w:val="1"/>
-        </w:numPr>
-        <w:pBdr>
-          <w:top w:space="0" w:sz="0" w:val="nil"/>
-          <w:left w:space="0" w:sz="0" w:val="nil"/>
-          <w:bottom w:space="0" w:sz="0" w:val="nil"/>
-          <w:right w:space="0" w:sz="0" w:val="nil"/>
-          <w:between w:space="0" w:sz="0" w:val="nil"/>
-        </w:pBdr>
-        <w:shd w:fill="auto" w:val="clear"/>
-        <w:spacing w:after="0" w:afterAutospacing="0" w:before="0" w:beforeAutospacing="0" w:line="240" w:lineRule="auto"/>
-        <w:ind w:left="720" w:hanging="360"/>
-        <w:jc w:val="both"/>
-        <w:rPr>
-          <w:u w:val="none"/>
-        </w:rPr>
-      </w:pPr>
-      <w:r>
-        <w:rPr>
-          <w:rtl w:val="0"/>
-        </w:rPr>
-        <w:t xml:space="preserve">Estruturei a publicação de pacotes npm privados no GitLab Registry, criando um fluxo que viabilizou o reúso eficiente de bibliotecas de código (como a lib de analytics) entre múltiplas aplicações.</w:t>
-      </w:r>
-    </w:p>
-    <w:p>
-      <w:pPr>
-        <w:pageBreakBefore w:val="0"/>
-        <w:numPr>
-          <w:ilvl w:val="0"/>
-          <w:numId w:val="1"/>
-        </w:numPr>
-        <w:pBdr>
-          <w:top w:space="0" w:sz="0" w:val="nil"/>
-          <w:left w:space="0" w:sz="0" w:val="nil"/>
-          <w:bottom w:space="0" w:sz="0" w:val="nil"/>
-          <w:right w:space="0" w:sz="0" w:val="nil"/>
-          <w:between w:space="0" w:sz="0" w:val="nil"/>
-        </w:pBdr>
-        <w:shd w:fill="auto" w:val="clear"/>
         <w:spacing w:before="0" w:beforeAutospacing="0" w:line="240" w:lineRule="auto"/>
         <w:ind w:left="720" w:hanging="360"/>
         <w:jc w:val="both"/>
@@ -723,83 +818,50 @@
         <w:rPr>
           <w:rtl w:val="0"/>
         </w:rPr>
-        <w:t xml:space="preserve">Documentei processos técnicos relacionados ao gerenciamento de URLs e variáveis de ambiente utilizando Markdown e incorporei ferramentas de inteligência artificial, como </w:t>
-      </w:r>
-      <w:r>
-        <w:rPr>
-          <w:rtl w:val="0"/>
-        </w:rPr>
-        <w:t xml:space="preserve">GitHub Copilot</w:t>
-      </w:r>
-      <w:r>
-        <w:rPr>
-          <w:rtl w:val="0"/>
-        </w:rPr>
-        <w:t xml:space="preserve"> e Claude, ao fluxo de desenvolvimento.</w:t>
-      </w:r>
-    </w:p>
-    <w:p>
-      <w:pPr>
-        <w:pageBreakBefore w:val="0"/>
-        <w:pBdr>
-          <w:top w:space="0" w:sz="0" w:val="nil"/>
-          <w:left w:space="0" w:sz="0" w:val="nil"/>
-          <w:bottom w:space="0" w:sz="0" w:val="nil"/>
-          <w:right w:space="0" w:sz="0" w:val="nil"/>
-          <w:between w:space="0" w:sz="0" w:val="nil"/>
-        </w:pBdr>
-        <w:shd w:fill="auto" w:val="clear"/>
-        <w:spacing w:before="80" w:line="240" w:lineRule="auto"/>
+        <w:t xml:space="preserve">Orquestrei a integração de aplicações front-end com APIs REST, atuando ativamente na definição de arquitetura e contratos de comunicação entre serviços.</w:t>
+      </w:r>
+    </w:p>
+    <w:p>
+      <w:pPr>
+        <w:spacing w:line="240" w:lineRule="auto"/>
         <w:ind w:left="0" w:firstLine="0"/>
         <w:jc w:val="both"/>
         <w:rPr/>
       </w:pPr>
       <w:r>
         <w:rPr>
-          <w:i w:val="1"/>
-          <w:iCs w:val="1"/>
-          <w:rtl w:val="0"/>
-        </w:rPr>
-        <w:t xml:space="preserve">Tech Stack: React, Next.js, TypeScript, Mixpanel, AWS Redshift, AWS Athena, Braze SDK, Service Workers, Jest, npm, GitLab Registry, Markdown, IA (Copilot, Claude).</w:t>
-      </w:r>
-      <w:r>
-        <w:br w:type="page"/>
-      </w:r>
-      <w:r>
-        <w:rPr>
-          <w:rtl w:val="0"/>
-        </w:rPr>
-      </w:r>
-    </w:p>
-    <w:p>
-      <w:pPr>
-        <w:pStyle w:val="Heading2"/>
+          <w:b w:val="1"/>
+          <w:bCs w:val="1"/>
+          <w:rtl w:val="0"/>
+        </w:rPr>
+        <w:t xml:space="preserve">Tech Stack</w:t>
+      </w:r>
+      <w:r>
+        <w:rPr>
+          <w:rtl w:val="0"/>
+        </w:rPr>
+        <w:t xml:space="preserve">: React, TypeScript, Redux, SASS, LESS, Jest, React Testing Library, APIs REST.</w:t>
+      </w:r>
+    </w:p>
+    <w:p>
+      <w:pPr>
+        <w:pStyle w:val="Heading3"/>
         <w:keepNext w:val="0"/>
         <w:keepLines w:val="0"/>
-        <w:rPr>
-          <w:color w:val="666666"/>
-          <w:sz w:val="20"/>
-          <w:szCs w:val="20"/>
-        </w:rPr>
-      </w:pPr>
-      <w:bookmarkStart w:colFirst="0" w:colLast="0" w:name="_em3nacji519j" w:id="6"/>
-      <w:bookmarkEnd w:id="6"/>
-      <w:r>
-        <w:rPr>
-          <w:color w:val="000000"/>
-          <w:rtl w:val="0"/>
-        </w:rPr>
-        <w:t xml:space="preserve">Infoprice</w:t>
-      </w:r>
-      <w:r>
-        <w:rPr>
-          <w:rtl w:val="0"/>
-        </w:rPr>
+        <w:rPr/>
+      </w:pPr>
+      <w:bookmarkStart w:colFirst="0" w:colLast="0" w:name="_xwuju1b8ahli" w:id="9"/>
+      <w:bookmarkEnd w:id="9"/>
+      <w:r>
+        <w:rPr>
+          <w:rtl w:val="0"/>
+        </w:rPr>
+        <w:t xml:space="preserve">Desenvolvedor de Front-end Júnior</w:t>
       </w:r>
     </w:p>
     <w:tbl>
       <w:tblPr>
-        <w:tblStyle w:val="Table2"/>
+        <w:tblStyle w:val="Table3"/>
         <w:tblW w:w="9480.0" w:type="dxa"/>
         <w:jc w:val="left"/>
         <w:tblLayout w:type="fixed"/>
@@ -818,7 +880,6 @@
       <w:tr>
         <w:trPr>
           <w:cantSplit w:val="1"/>
-          <w:trHeight w:val="566.9291338582677" w:hRule="atLeast"/>
           <w:tblHeader w:val="0"/>
         </w:trPr>
         <w:tc>
@@ -844,7 +905,7 @@
                 <w:color w:val="666666"/>
                 <w:rtl w:val="0"/>
               </w:rPr>
-              <w:t xml:space="preserve">Desenvolvedor de Front-end</w:t>
+              <w:t xml:space="preserve">Bornlogic</w:t>
             </w:r>
           </w:p>
         </w:tc>
@@ -861,22 +922,18 @@
           </w:tcPr>
           <w:p>
             <w:pPr>
+              <w:pStyle w:val="Heading4"/>
               <w:spacing w:line="240" w:lineRule="auto"/>
               <w:jc w:val="right"/>
-              <w:rPr>
-                <w:color w:val="666666"/>
-                <w:sz w:val="20"/>
-                <w:szCs w:val="20"/>
-              </w:rPr>
+              <w:rPr/>
             </w:pPr>
+            <w:bookmarkStart w:colFirst="0" w:colLast="0" w:name="_6gbm8rkd6mj9" w:id="10"/>
+            <w:bookmarkEnd w:id="10"/>
             <w:r>
               <w:rPr>
-                <w:color w:val="666666"/>
-                <w:sz w:val="20"/>
-                <w:szCs w:val="20"/>
                 <w:rtl w:val="0"/>
               </w:rPr>
-              <w:t xml:space="preserve">JUNHO DE 2023 — OUTUBRO DE 2025</w:t>
+              <w:t xml:space="preserve">AGO 2022 — JAN 2023</w:t>
             </w:r>
           </w:p>
         </w:tc>
@@ -888,7 +945,7 @@
           <w:ilvl w:val="0"/>
           <w:numId w:val="1"/>
         </w:numPr>
-        <w:spacing w:after="0" w:afterAutospacing="0" w:line="240" w:lineRule="auto"/>
+        <w:spacing w:after="0" w:afterAutospacing="0" w:before="200" w:line="240" w:lineRule="auto"/>
         <w:ind w:left="720" w:hanging="360"/>
         <w:jc w:val="both"/>
         <w:rPr>
@@ -899,7 +956,7 @@
         <w:rPr>
           <w:rtl w:val="0"/>
         </w:rPr>
-        <w:t xml:space="preserve">Desenvolvi e mantive o front-end de uma plataforma SaaS B2B de precificação utilizada por mais de 27.000 lojas, utilizando React, TypeScript e Redux para gerenciamento de estado global.</w:t>
+        <w:t xml:space="preserve">Liderei a estruturação do Design System com Storybook e MDX, otimizando a produtividade do time através da criação de 50+ componentes reutilizáveis e reduzindo o tempo de desenvolvimento em 30%.</w:t>
       </w:r>
     </w:p>
     <w:p>
@@ -919,7 +976,7 @@
         <w:rPr>
           <w:rtl w:val="0"/>
         </w:rPr>
-        <w:t xml:space="preserve">Desenvolvi e evoluí componentes do Design System utilizando SASS e LESS, promovendo consistência visual e reutilização de código.</w:t>
+        <w:t xml:space="preserve">Arquitetei interfaces escaláveis, responsivas e acessíveis com React, TypeScript e Styled-components, mitigando em 40% o retrabalho por inconsistências visuais através da padronização técnica.</w:t>
       </w:r>
     </w:p>
     <w:p>
@@ -939,7 +996,13 @@
         <w:rPr>
           <w:rtl w:val="0"/>
         </w:rPr>
-        <w:t xml:space="preserve">Implementei testes automatizados com Jest e React Testing Library, cobrindo cenários críticos de negócio e aumentando a confiabilidade das entregas.</w:t>
+        <w:t xml:space="preserve">Assegurei</w:t>
+      </w:r>
+      <w:r>
+        <w:rPr>
+          <w:rtl w:val="0"/>
+        </w:rPr>
+        <w:t xml:space="preserve"> a qualidade e estabilidade do produto em um time ágil de 5 desenvolvedores, implementando testes automatizados com Jest e React Testing Library e conduzindo revisões críticas de código.</w:t>
       </w:r>
     </w:p>
     <w:p>
@@ -959,7 +1022,7 @@
         <w:rPr>
           <w:rtl w:val="0"/>
         </w:rPr>
-        <w:t xml:space="preserve">Integrei aplicações front-end a serviços de back-end por meio de APIs REST, participando das decisões relacionadas à arquitetura e aos contratos de comunicação entre os serviços.</w:t>
+        <w:t xml:space="preserve">Gerenciei a documentação técnica do Sistema de Gestão da Qualidade (SGQ), garantindo a conformidade dos processos e a excelência na entrega de software.</w:t>
       </w:r>
     </w:p>
     <w:p>
@@ -967,18 +1030,46 @@
         <w:spacing w:line="240" w:lineRule="auto"/>
         <w:ind w:left="0" w:firstLine="0"/>
         <w:jc w:val="both"/>
-        <w:rPr>
-          <w:i w:val="1"/>
-          <w:iCs w:val="1"/>
-        </w:rPr>
-      </w:pPr>
-      <w:r>
-        <w:rPr>
-          <w:i w:val="1"/>
-          <w:iCs w:val="1"/>
-          <w:rtl w:val="0"/>
-        </w:rPr>
-        <w:t xml:space="preserve">Tech Stack: React, TypeScript, Redux, SASS, LESS, Jest, React Testing Library, APIs REST.</w:t>
+        <w:rPr/>
+      </w:pPr>
+      <w:r>
+        <w:rPr>
+          <w:b w:val="1"/>
+          <w:bCs w:val="1"/>
+          <w:rtl w:val="0"/>
+        </w:rPr>
+        <w:t xml:space="preserve">Tech Stack</w:t>
+      </w:r>
+      <w:r>
+        <w:rPr>
+          <w:rtl w:val="0"/>
+        </w:rPr>
+        <w:t xml:space="preserve">: React, TypeScript, Styled-components, Storybook, MDX, Jest, React Testing Library.</w:t>
+      </w:r>
+      <w:r>
+        <w:rPr>
+          <w:rtl w:val="0"/>
+        </w:rPr>
+      </w:r>
+    </w:p>
+    <w:p>
+      <w:pPr>
+        <w:ind w:firstLine="0"/>
+        <w:rPr>
+          <w:sz w:val="24"/>
+          <w:szCs w:val="24"/>
+          <w:highlight w:val="white"/>
+        </w:rPr>
+      </w:pPr>
+      <w:r>
+        <w:pict>
+          <v:rect style="width:0.0pt;height:1.5pt" o:hr="t" o:hrstd="t" o:hralign="center" fillcolor="#A0A0A0" stroked="f"/>
+        </w:pict>
+      </w:r>
+      <w:r>
+        <w:rPr>
+          <w:rtl w:val="0"/>
+        </w:rPr>
       </w:r>
     </w:p>
     <w:p>
@@ -986,49 +1077,56 @@
         <w:pStyle w:val="Heading2"/>
         <w:keepNext w:val="0"/>
         <w:keepLines w:val="0"/>
-        <w:rPr>
-          <w:color w:val="666666"/>
-          <w:sz w:val="20"/>
-          <w:szCs w:val="20"/>
-        </w:rPr>
-      </w:pPr>
-      <w:bookmarkStart w:colFirst="0" w:colLast="0" w:name="_xwuju1b8ahli" w:id="7"/>
-      <w:bookmarkEnd w:id="7"/>
-      <w:r>
-        <w:rPr>
-          <w:color w:val="000000"/>
-          <w:rtl w:val="0"/>
-        </w:rPr>
-        <w:t xml:space="preserve">Bornlogic</w:t>
-      </w:r>
-      <w:r>
-        <w:rPr>
-          <w:rtl w:val="0"/>
-        </w:rPr>
+        <w:spacing w:after="200" w:before="200" w:lineRule="auto"/>
+        <w:rPr/>
+      </w:pPr>
+      <w:bookmarkStart w:colFirst="0" w:colLast="0" w:name="_pwnp1k6vsbh1" w:id="11"/>
+      <w:bookmarkEnd w:id="11"/>
+      <w:r>
+        <w:rPr>
+          <w:rtl w:val="0"/>
+        </w:rPr>
+        <w:t xml:space="preserve">FORMAÇÃO ACADÊMICA</w:t>
+      </w:r>
+    </w:p>
+    <w:p>
+      <w:pPr>
+        <w:pStyle w:val="Heading3"/>
+        <w:keepNext w:val="0"/>
+        <w:keepLines w:val="0"/>
+        <w:spacing w:before="0" w:line="276" w:lineRule="auto"/>
+        <w:rPr/>
+      </w:pPr>
+      <w:bookmarkStart w:colFirst="0" w:colLast="0" w:name="_5rlytc7vh7ay" w:id="12"/>
+      <w:bookmarkEnd w:id="12"/>
+      <w:r>
+        <w:rPr>
+          <w:rtl w:val="0"/>
+        </w:rPr>
+        <w:t xml:space="preserve">Estácio</w:t>
       </w:r>
     </w:p>
     <w:tbl>
       <w:tblPr>
-        <w:tblStyle w:val="Table3"/>
-        <w:tblW w:w="9480.0" w:type="dxa"/>
+        <w:tblStyle w:val="Table4"/>
+        <w:tblW w:w="9378.0" w:type="dxa"/>
         <w:jc w:val="left"/>
         <w:tblLayout w:type="fixed"/>
         <w:tblLook w:val="0600"/>
       </w:tblPr>
       <w:tblGrid>
-        <w:gridCol w:w="4740"/>
-        <w:gridCol w:w="4740"/>
+        <w:gridCol w:w="4689"/>
+        <w:gridCol w:w="4689"/>
         <w:tblGridChange w:id="0">
           <w:tblGrid>
-            <w:gridCol w:w="4740"/>
-            <w:gridCol w:w="4740"/>
+            <w:gridCol w:w="4689"/>
+            <w:gridCol w:w="4689"/>
           </w:tblGrid>
         </w:tblGridChange>
       </w:tblGrid>
       <w:tr>
         <w:trPr>
-          <w:cantSplit w:val="1"/>
-          <w:trHeight w:val="566.9291338582677" w:hRule="atLeast"/>
+          <w:cantSplit w:val="0"/>
           <w:tblHeader w:val="0"/>
         </w:trPr>
         <w:tc>
@@ -1040,21 +1138,18 @@
               <w:bottom w:w="0.0" w:type="dxa"/>
               <w:right w:w="0.0" w:type="dxa"/>
             </w:tcMar>
-            <w:vAlign w:val="center"/>
+            <w:vAlign w:val="top"/>
           </w:tcPr>
           <w:p>
             <w:pPr>
-              <w:spacing w:line="240" w:lineRule="auto"/>
-              <w:rPr>
-                <w:color w:val="666666"/>
-              </w:rPr>
+              <w:spacing w:before="0" w:lineRule="auto"/>
+              <w:rPr/>
             </w:pPr>
             <w:r>
               <w:rPr>
-                <w:color w:val="666666"/>
                 <w:rtl w:val="0"/>
               </w:rPr>
-              <w:t xml:space="preserve">Desenvolvedor de Front-end</w:t>
+              <w:t xml:space="preserve">Análise e Desenvolvimento de Sistemas</w:t>
             </w:r>
           </w:p>
         </w:tc>
@@ -1067,276 +1162,27 @@
               <w:bottom w:w="0.0" w:type="dxa"/>
               <w:right w:w="0.0" w:type="dxa"/>
             </w:tcMar>
-            <w:vAlign w:val="center"/>
+            <w:vAlign w:val="top"/>
           </w:tcPr>
           <w:p>
             <w:pPr>
-              <w:spacing w:line="240" w:lineRule="auto"/>
-              <w:jc w:val="right"/>
-              <w:rPr>
-                <w:color w:val="666666"/>
-                <w:sz w:val="20"/>
-                <w:szCs w:val="20"/>
-              </w:rPr>
+              <w:pStyle w:val="Heading4"/>
+              <w:widowControl w:val="0"/>
+              <w:spacing w:before="0" w:line="240" w:lineRule="auto"/>
+              <w:rPr/>
             </w:pPr>
+            <w:bookmarkStart w:colFirst="0" w:colLast="0" w:name="_ww244w94lp1r" w:id="13"/>
+            <w:bookmarkEnd w:id="13"/>
             <w:r>
               <w:rPr>
-                <w:color w:val="666666"/>
-                <w:sz w:val="20"/>
-                <w:szCs w:val="20"/>
                 <w:rtl w:val="0"/>
               </w:rPr>
-              <w:t xml:space="preserve">AGOSTO DE 2022 — JANEIRO DE 2023</w:t>
+              <w:t xml:space="preserve">2020 — 2023</w:t>
             </w:r>
           </w:p>
         </w:tc>
       </w:tr>
     </w:tbl>
-    <w:p>
-      <w:pPr>
-        <w:numPr>
-          <w:ilvl w:val="0"/>
-          <w:numId w:val="1"/>
-        </w:numPr>
-        <w:spacing w:after="0" w:afterAutospacing="0" w:line="240" w:lineRule="auto"/>
-        <w:ind w:left="720" w:hanging="360"/>
-        <w:jc w:val="both"/>
-        <w:rPr>
-          <w:highlight w:val="white"/>
-        </w:rPr>
-      </w:pPr>
-      <w:r>
-        <w:rPr>
-          <w:rtl w:val="0"/>
-        </w:rPr>
-        <w:t xml:space="preserve">Estruturei o Design System da empresa utilizando Storybook e MDX, estabelecendo um ambiente para desenvolvimento, documentação e reúso de componentes.</w:t>
-      </w:r>
-    </w:p>
-    <w:p>
-      <w:pPr>
-        <w:numPr>
-          <w:ilvl w:val="0"/>
-          <w:numId w:val="1"/>
-        </w:numPr>
-        <w:spacing w:after="0" w:afterAutospacing="0" w:before="0" w:beforeAutospacing="0" w:line="240" w:lineRule="auto"/>
-        <w:ind w:left="720" w:hanging="360"/>
-        <w:jc w:val="both"/>
-      </w:pPr>
-      <w:r>
-        <w:rPr>
-          <w:rtl w:val="0"/>
-        </w:rPr>
-        <w:t xml:space="preserve">Desenvolvi componentes de interface escaláveis, responsivos e acessíveis utilizando React e TypeScript, com estilos encapsulados por Styled-components.</w:t>
-      </w:r>
-    </w:p>
-    <w:p>
-      <w:pPr>
-        <w:numPr>
-          <w:ilvl w:val="0"/>
-          <w:numId w:val="1"/>
-        </w:numPr>
-        <w:spacing w:after="0" w:afterAutospacing="0" w:before="0" w:beforeAutospacing="0" w:line="240" w:lineRule="auto"/>
-        <w:ind w:left="720" w:hanging="360"/>
-        <w:jc w:val="both"/>
-      </w:pPr>
-      <w:r>
-        <w:rPr>
-          <w:rtl w:val="0"/>
-        </w:rPr>
-        <w:t xml:space="preserve">Implementei testes automatizados com Jest e React Testing Library, cobrindo comportamentos críticos dos componentes e reduzindo regressões nas entregas.</w:t>
-      </w:r>
-    </w:p>
-    <w:p>
-      <w:pPr>
-        <w:numPr>
-          <w:ilvl w:val="0"/>
-          <w:numId w:val="1"/>
-        </w:numPr>
-        <w:spacing w:after="0" w:afterAutospacing="0" w:before="0" w:beforeAutospacing="0" w:line="240" w:lineRule="auto"/>
-        <w:ind w:left="720" w:hanging="360"/>
-        <w:jc w:val="both"/>
-      </w:pPr>
-      <w:r>
-        <w:rPr>
-          <w:rtl w:val="0"/>
-        </w:rPr>
-        <w:t xml:space="preserve">Atuei em revisões de código por meio de Pull Requests, contribuindo para a padronização técnica e qualidade do código.</w:t>
-      </w:r>
-    </w:p>
-    <w:p>
-      <w:pPr>
-        <w:numPr>
-          <w:ilvl w:val="0"/>
-          <w:numId w:val="1"/>
-        </w:numPr>
-        <w:spacing w:before="0" w:beforeAutospacing="0" w:line="240" w:lineRule="auto"/>
-        <w:ind w:left="720" w:hanging="360"/>
-        <w:jc w:val="both"/>
-        <w:rPr>
-          <w:u w:val="none"/>
-        </w:rPr>
-      </w:pPr>
-      <w:r>
-        <w:rPr>
-          <w:rtl w:val="0"/>
-        </w:rPr>
-        <w:t xml:space="preserve">Mantive a documentação técnica relacionada ao Sistema de Gestão da Qualidade (SGQ), garantindo a conformidade dos processos de desenvolvimento.</w:t>
-      </w:r>
-    </w:p>
-    <w:p>
-      <w:pPr>
-        <w:spacing w:line="240" w:lineRule="auto"/>
-        <w:ind w:left="0" w:firstLine="0"/>
-        <w:jc w:val="both"/>
-        <w:rPr>
-          <w:i w:val="1"/>
-          <w:iCs w:val="1"/>
-        </w:rPr>
-      </w:pPr>
-      <w:r>
-        <w:rPr>
-          <w:i w:val="1"/>
-          <w:iCs w:val="1"/>
-          <w:rtl w:val="0"/>
-        </w:rPr>
-        <w:t xml:space="preserve">Tech Stack: React, TypeScript, Styled-components, Storybook, MDX, Jest, React Testing Library.</w:t>
-      </w:r>
-      <w:r>
-        <w:rPr>
-          <w:rtl w:val="0"/>
-        </w:rPr>
-      </w:r>
-    </w:p>
-    <w:p>
-      <w:pPr>
-        <w:ind w:firstLine="0"/>
-        <w:rPr>
-          <w:sz w:val="24"/>
-          <w:szCs w:val="24"/>
-          <w:highlight w:val="white"/>
-        </w:rPr>
-      </w:pPr>
-      <w:r>
-        <w:pict>
-          <v:rect style="width:0.0pt;height:1.5pt" o:hr="t" o:hrstd="t" o:hralign="center" fillcolor="#A0A0A0" stroked="f"/>
-        </w:pict>
-      </w:r>
-      <w:r>
-        <w:rPr>
-          <w:rtl w:val="0"/>
-        </w:rPr>
-      </w:r>
-    </w:p>
-    <w:p>
-      <w:pPr>
-        <w:pStyle w:val="Heading1"/>
-        <w:keepNext w:val="0"/>
-        <w:keepLines w:val="0"/>
-        <w:pageBreakBefore w:val="0"/>
-        <w:pBdr>
-          <w:top w:space="0" w:sz="0" w:val="nil"/>
-          <w:left w:space="0" w:sz="0" w:val="nil"/>
-          <w:bottom w:space="0" w:sz="0" w:val="nil"/>
-          <w:right w:space="0" w:sz="0" w:val="nil"/>
-          <w:between w:space="0" w:sz="0" w:val="nil"/>
-        </w:pBdr>
-        <w:shd w:fill="auto" w:val="clear"/>
-        <w:spacing w:after="200" w:before="200" w:line="240" w:lineRule="auto"/>
-        <w:rPr>
-          <w:rFonts w:ascii="Proxima Nova" w:cs="Proxima Nova" w:eastAsia="Proxima Nova" w:hAnsi="Proxima Nova"/>
-          <w:b w:val="1"/>
-          <w:bCs w:val="1"/>
-          <w:color w:val="c18c5d"/>
-          <w:sz w:val="30"/>
-          <w:szCs w:val="30"/>
-        </w:rPr>
-      </w:pPr>
-      <w:bookmarkStart w:colFirst="0" w:colLast="0" w:name="_pwnp1k6vsbh1" w:id="8"/>
-      <w:bookmarkEnd w:id="8"/>
-      <w:r>
-        <w:rPr>
-          <w:color w:val="c18c5d"/>
-          <w:sz w:val="30"/>
-          <w:szCs w:val="30"/>
-          <w:rtl w:val="0"/>
-        </w:rPr>
-        <w:t xml:space="preserve">FORMAÇÃO ACADÊMICA</w:t>
-      </w:r>
-      <w:r>
-        <w:rPr>
-          <w:rtl w:val="0"/>
-        </w:rPr>
-      </w:r>
-    </w:p>
-    <w:p>
-      <w:pPr>
-        <w:pStyle w:val="Heading2"/>
-        <w:keepNext w:val="0"/>
-        <w:keepLines w:val="0"/>
-        <w:spacing w:before="0" w:lineRule="auto"/>
-        <w:rPr>
-          <w:color w:val="000000"/>
-        </w:rPr>
-      </w:pPr>
-      <w:bookmarkStart w:colFirst="0" w:colLast="0" w:name="_5rlytc7vh7ay" w:id="9"/>
-      <w:bookmarkEnd w:id="9"/>
-      <w:r>
-        <w:rPr>
-          <w:color w:val="000000"/>
-          <w:rtl w:val="0"/>
-        </w:rPr>
-        <w:t xml:space="preserve">Estácio</w:t>
-      </w:r>
-      <w:r>
-        <w:rPr>
-          <w:rtl w:val="0"/>
-        </w:rPr>
-      </w:r>
-    </w:p>
-    <w:p>
-      <w:pPr>
-        <w:pStyle w:val="Heading2"/>
-        <w:spacing w:before="0" w:lineRule="auto"/>
-        <w:rPr/>
-      </w:pPr>
-      <w:bookmarkStart w:colFirst="0" w:colLast="0" w:name="_by53aibnagcg" w:id="10"/>
-      <w:bookmarkEnd w:id="10"/>
-      <w:r>
-        <w:rPr>
-          <w:rtl w:val="0"/>
-        </w:rPr>
-        <w:t xml:space="preserve">Análise de Sistemas de Computação</w:t>
-      </w:r>
-      <w:r>
-        <w:rPr>
-          <w:rtl w:val="0"/>
-        </w:rPr>
-      </w:r>
-    </w:p>
-    <w:p>
-      <w:pPr>
-        <w:spacing w:line="240" w:lineRule="auto"/>
-        <w:rPr>
-          <w:color w:val="666666"/>
-          <w:sz w:val="20"/>
-          <w:szCs w:val="20"/>
-        </w:rPr>
-      </w:pPr>
-      <w:r>
-        <w:rPr>
-          <w:color w:val="666666"/>
-          <w:sz w:val="20"/>
-          <w:szCs w:val="20"/>
-          <w:rtl w:val="0"/>
-        </w:rPr>
-        <w:t xml:space="preserve">2020 - 2023</w:t>
-      </w:r>
-      <w:r>
-        <w:rPr>
-          <w:rtl w:val="0"/>
-        </w:rPr>
-      </w:r>
-    </w:p>
     <w:p>
       <w:pPr>
         <w:pageBreakBefore w:val="0"/>
@@ -1364,250 +1210,158 @@
     </w:p>
     <w:p>
       <w:pPr>
-        <w:pStyle w:val="Heading1"/>
-        <w:keepNext w:val="0"/>
-        <w:keepLines w:val="0"/>
-        <w:pageBreakBefore w:val="0"/>
-        <w:pBdr>
-          <w:top w:space="0" w:sz="0" w:val="nil"/>
-          <w:left w:space="0" w:sz="0" w:val="nil"/>
-          <w:bottom w:space="0" w:sz="0" w:val="nil"/>
-          <w:right w:space="0" w:sz="0" w:val="nil"/>
-          <w:between w:space="0" w:sz="0" w:val="nil"/>
-        </w:pBdr>
-        <w:shd w:fill="auto" w:val="clear"/>
-        <w:spacing w:after="200" w:before="200" w:line="240" w:lineRule="auto"/>
-        <w:rPr>
-          <w:rFonts w:ascii="Proxima Nova" w:cs="Proxima Nova" w:eastAsia="Proxima Nova" w:hAnsi="Proxima Nova"/>
+        <w:pStyle w:val="Heading2"/>
+        <w:rPr/>
+      </w:pPr>
+      <w:bookmarkStart w:colFirst="0" w:colLast="0" w:name="_2jqvh01mc2lp" w:id="14"/>
+      <w:bookmarkEnd w:id="14"/>
+      <w:r>
+        <w:rPr>
+          <w:rtl w:val="0"/>
+        </w:rPr>
+        <w:t xml:space="preserve">IDIOMAS</w:t>
+      </w:r>
+    </w:p>
+    <w:p>
+      <w:pPr>
+        <w:rPr/>
+      </w:pPr>
+      <w:r>
+        <w:rPr>
           <w:b w:val="1"/>
           <w:bCs w:val="1"/>
-          <w:color w:val="c18c5d"/>
-          <w:sz w:val="30"/>
-          <w:szCs w:val="30"/>
-        </w:rPr>
-      </w:pPr>
-      <w:bookmarkStart w:colFirst="0" w:colLast="0" w:name="_3hy8rkwzatey" w:id="11"/>
-      <w:bookmarkEnd w:id="11"/>
-      <w:r>
-        <w:rPr>
-          <w:color w:val="c18c5d"/>
-          <w:sz w:val="30"/>
-          <w:szCs w:val="30"/>
-          <w:rtl w:val="0"/>
-        </w:rPr>
-        <w:t xml:space="preserve">INFORMAÇÕES COMPLEMENTARES  </w:t>
-      </w:r>
-      <w:r>
-        <w:rPr>
-          <w:rtl w:val="0"/>
-        </w:rPr>
-      </w:r>
-    </w:p>
-    <w:p>
-      <w:pPr>
-        <w:pageBreakBefore w:val="0"/>
-        <w:numPr>
-          <w:ilvl w:val="0"/>
-          <w:numId w:val="2"/>
-        </w:numPr>
-        <w:pBdr>
-          <w:top w:space="0" w:sz="0" w:val="nil"/>
-          <w:left w:space="0" w:sz="0" w:val="nil"/>
-          <w:bottom w:space="0" w:sz="0" w:val="nil"/>
-          <w:right w:space="0" w:sz="0" w:val="nil"/>
-          <w:between w:space="0" w:sz="0" w:val="nil"/>
-        </w:pBdr>
-        <w:shd w:fill="auto" w:val="clear"/>
-        <w:spacing w:after="0" w:afterAutospacing="0" w:before="80" w:line="288" w:lineRule="auto"/>
-        <w:ind w:left="720" w:hanging="360"/>
-        <w:rPr>
-          <w:sz w:val="24"/>
-          <w:szCs w:val="24"/>
-        </w:rPr>
-      </w:pPr>
-      <w:r>
-        <w:rPr>
-          <w:sz w:val="24"/>
-          <w:szCs w:val="24"/>
-          <w:rtl w:val="0"/>
-        </w:rPr>
-        <w:t xml:space="preserve">Inglês — Avançado</w:t>
-      </w:r>
-    </w:p>
-    <w:p>
-      <w:pPr>
-        <w:pageBreakBefore w:val="0"/>
-        <w:numPr>
-          <w:ilvl w:val="0"/>
-          <w:numId w:val="2"/>
-        </w:numPr>
-        <w:pBdr>
-          <w:top w:space="0" w:sz="0" w:val="nil"/>
-          <w:left w:space="0" w:sz="0" w:val="nil"/>
-          <w:bottom w:space="0" w:sz="0" w:val="nil"/>
-          <w:right w:space="0" w:sz="0" w:val="nil"/>
-          <w:between w:space="0" w:sz="0" w:val="nil"/>
-        </w:pBdr>
-        <w:shd w:fill="auto" w:val="clear"/>
-        <w:spacing w:after="0" w:afterAutospacing="0" w:before="0" w:beforeAutospacing="0" w:line="288" w:lineRule="auto"/>
-        <w:ind w:left="720" w:hanging="360"/>
-        <w:rPr>
-          <w:sz w:val="24"/>
-          <w:szCs w:val="24"/>
-          <w:u w:val="none"/>
-        </w:rPr>
-      </w:pPr>
-      <w:r>
-        <w:rPr>
-          <w:sz w:val="24"/>
-          <w:szCs w:val="24"/>
-          <w:rtl w:val="0"/>
-        </w:rPr>
-        <w:t xml:space="preserve">Curso: React Avançado — Origamid (out/2025)</w:t>
-      </w:r>
-    </w:p>
-    <w:p>
-      <w:pPr>
-        <w:pageBreakBefore w:val="0"/>
-        <w:numPr>
-          <w:ilvl w:val="0"/>
-          <w:numId w:val="2"/>
-        </w:numPr>
-        <w:pBdr>
-          <w:top w:space="0" w:sz="0" w:val="nil"/>
-          <w:left w:space="0" w:sz="0" w:val="nil"/>
-          <w:bottom w:space="0" w:sz="0" w:val="nil"/>
-          <w:right w:space="0" w:sz="0" w:val="nil"/>
-          <w:between w:space="0" w:sz="0" w:val="nil"/>
-        </w:pBdr>
-        <w:shd w:fill="auto" w:val="clear"/>
-        <w:spacing w:after="0" w:afterAutospacing="0" w:before="0" w:beforeAutospacing="0" w:line="288" w:lineRule="auto"/>
-        <w:ind w:left="720" w:hanging="360"/>
-        <w:rPr>
-          <w:sz w:val="24"/>
-          <w:szCs w:val="24"/>
-          <w:u w:val="none"/>
-        </w:rPr>
-      </w:pPr>
-      <w:r>
-        <w:rPr>
-          <w:sz w:val="24"/>
-          <w:szCs w:val="24"/>
-          <w:rtl w:val="0"/>
-        </w:rPr>
-        <w:t xml:space="preserve">Curso: JavaScript ES6+ — Origamid (mar/2022)</w:t>
-      </w:r>
-    </w:p>
-    <w:p>
-      <w:pPr>
-        <w:pageBreakBefore w:val="0"/>
-        <w:numPr>
-          <w:ilvl w:val="0"/>
-          <w:numId w:val="2"/>
-        </w:numPr>
-        <w:pBdr>
-          <w:top w:space="0" w:sz="0" w:val="nil"/>
-          <w:left w:space="0" w:sz="0" w:val="nil"/>
-          <w:bottom w:space="0" w:sz="0" w:val="nil"/>
-          <w:right w:space="0" w:sz="0" w:val="nil"/>
-          <w:between w:space="0" w:sz="0" w:val="nil"/>
-        </w:pBdr>
-        <w:shd w:fill="auto" w:val="clear"/>
-        <w:spacing w:after="0" w:afterAutospacing="0" w:before="0" w:beforeAutospacing="0" w:line="288" w:lineRule="auto"/>
-        <w:ind w:left="720" w:hanging="360"/>
-        <w:rPr>
-          <w:sz w:val="24"/>
-          <w:szCs w:val="24"/>
-          <w:u w:val="none"/>
-        </w:rPr>
-      </w:pPr>
-      <w:r>
-        <w:rPr>
-          <w:sz w:val="24"/>
-          <w:szCs w:val="24"/>
-          <w:rtl w:val="0"/>
-        </w:rPr>
-        <w:t xml:space="preserve">Curso: CSS Flexbox — Origamid (jun/2021)</w:t>
-      </w:r>
-    </w:p>
-    <w:p>
-      <w:pPr>
-        <w:pageBreakBefore w:val="0"/>
-        <w:numPr>
-          <w:ilvl w:val="0"/>
-          <w:numId w:val="2"/>
-        </w:numPr>
-        <w:pBdr>
-          <w:top w:space="0" w:sz="0" w:val="nil"/>
-          <w:left w:space="0" w:sz="0" w:val="nil"/>
-          <w:bottom w:space="0" w:sz="0" w:val="nil"/>
-          <w:right w:space="0" w:sz="0" w:val="nil"/>
-          <w:between w:space="0" w:sz="0" w:val="nil"/>
-        </w:pBdr>
-        <w:shd w:fill="auto" w:val="clear"/>
-        <w:spacing w:after="0" w:afterAutospacing="0" w:before="0" w:beforeAutospacing="0" w:line="288" w:lineRule="auto"/>
-        <w:ind w:left="720" w:hanging="360"/>
-        <w:rPr>
-          <w:sz w:val="24"/>
-          <w:szCs w:val="24"/>
-          <w:u w:val="none"/>
-        </w:rPr>
-      </w:pPr>
-      <w:r>
-        <w:rPr>
-          <w:sz w:val="24"/>
-          <w:szCs w:val="24"/>
-          <w:rtl w:val="0"/>
-        </w:rPr>
-        <w:t xml:space="preserve">Curso: CSS grid Layout — Origamid (jun/2021)</w:t>
-      </w:r>
-    </w:p>
-    <w:p>
-      <w:pPr>
-        <w:pageBreakBefore w:val="0"/>
-        <w:numPr>
-          <w:ilvl w:val="0"/>
-          <w:numId w:val="2"/>
-        </w:numPr>
-        <w:pBdr>
-          <w:top w:space="0" w:sz="0" w:val="nil"/>
-          <w:left w:space="0" w:sz="0" w:val="nil"/>
-          <w:bottom w:space="0" w:sz="0" w:val="nil"/>
-          <w:right w:space="0" w:sz="0" w:val="nil"/>
-          <w:between w:space="0" w:sz="0" w:val="nil"/>
-        </w:pBdr>
-        <w:shd w:fill="auto" w:val="clear"/>
-        <w:spacing w:before="0" w:beforeAutospacing="0" w:line="288" w:lineRule="auto"/>
-        <w:ind w:left="720" w:hanging="360"/>
-        <w:rPr>
-          <w:sz w:val="24"/>
-          <w:szCs w:val="24"/>
-          <w:u w:val="none"/>
-        </w:rPr>
-      </w:pPr>
-      <w:r>
-        <w:rPr>
-          <w:sz w:val="24"/>
-          <w:szCs w:val="24"/>
-          <w:rtl w:val="0"/>
-        </w:rPr>
-        <w:t xml:space="preserve">Curso: Desenvolvimento Web — Hcode (</w:t>
-      </w:r>
-      <w:r>
-        <w:rPr>
-          <w:sz w:val="24"/>
-          <w:szCs w:val="24"/>
-          <w:rtl w:val="0"/>
-        </w:rPr>
-        <w:t xml:space="preserve">mai</w:t>
-      </w:r>
-      <w:r>
-        <w:rPr>
-          <w:sz w:val="24"/>
-          <w:szCs w:val="24"/>
-          <w:rtl w:val="0"/>
-        </w:rPr>
-        <w:t xml:space="preserve">/2021)</w:t>
+          <w:rtl w:val="0"/>
+        </w:rPr>
+        <w:t xml:space="preserve">Português </w:t>
+      </w:r>
+      <w:r>
+        <w:rPr>
+          <w:rtl w:val="0"/>
+        </w:rPr>
+        <w:t xml:space="preserve">— Nativo</w:t>
+      </w:r>
+    </w:p>
+    <w:p>
+      <w:pPr>
+        <w:rPr/>
+      </w:pPr>
+      <w:r>
+        <w:rPr>
+          <w:b w:val="1"/>
+          <w:bCs w:val="1"/>
+          <w:rtl w:val="0"/>
+        </w:rPr>
+        <w:t xml:space="preserve">Inglês </w:t>
+      </w:r>
+      <w:r>
+        <w:rPr>
+          <w:rtl w:val="0"/>
+        </w:rPr>
+        <w:t xml:space="preserve">— Avançado</w:t>
+      </w:r>
+    </w:p>
+    <w:p>
+      <w:pPr>
+        <w:rPr/>
+      </w:pPr>
+      <w:r>
+        <w:pict>
+          <v:rect style="width:0.0pt;height:1.5pt" o:hr="t" o:hrstd="t" o:hralign="center" fillcolor="#A0A0A0" stroked="f"/>
+        </w:pict>
+      </w:r>
+      <w:r>
+        <w:rPr>
+          <w:rtl w:val="0"/>
+        </w:rPr>
+      </w:r>
+    </w:p>
+    <w:p>
+      <w:pPr>
+        <w:pStyle w:val="Heading2"/>
+        <w:rPr/>
+      </w:pPr>
+      <w:bookmarkStart w:colFirst="0" w:colLast="0" w:name="_hs1ojr4rehux" w:id="15"/>
+      <w:bookmarkEnd w:id="15"/>
+      <w:r>
+        <w:rPr>
+          <w:rtl w:val="0"/>
+        </w:rPr>
+        <w:t xml:space="preserve">CERTIFICAÇÕES</w:t>
+      </w:r>
+    </w:p>
+    <w:p>
+      <w:pPr>
+        <w:rPr/>
+      </w:pPr>
+      <w:r>
+        <w:rPr>
+          <w:b w:val="1"/>
+          <w:bCs w:val="1"/>
+          <w:rtl w:val="0"/>
+        </w:rPr>
+        <w:t xml:space="preserve">Next.js</w:t>
+      </w:r>
+      <w:r>
+        <w:rPr>
+          <w:rtl w:val="0"/>
+        </w:rPr>
+        <w:t xml:space="preserve"> - Origamid (nov/2025), </w:t>
+      </w:r>
+      <w:r>
+        <w:rPr>
+          <w:b w:val="1"/>
+          <w:bCs w:val="1"/>
+          <w:rtl w:val="0"/>
+        </w:rPr>
+        <w:t xml:space="preserve">React Avançado</w:t>
+      </w:r>
+      <w:r>
+        <w:rPr>
+          <w:rtl w:val="0"/>
+        </w:rPr>
+        <w:t xml:space="preserve"> - Origamid (out/2025), </w:t>
+      </w:r>
+      <w:r>
+        <w:rPr>
+          <w:b w:val="1"/>
+          <w:bCs w:val="1"/>
+          <w:rtl w:val="0"/>
+        </w:rPr>
+        <w:t xml:space="preserve">JavaScript ES6+</w:t>
+      </w:r>
+      <w:r>
+        <w:rPr>
+          <w:rtl w:val="0"/>
+        </w:rPr>
+        <w:t xml:space="preserve"> - Origamid (mar/2022), </w:t>
+      </w:r>
+      <w:r>
+        <w:rPr>
+          <w:b w:val="1"/>
+          <w:bCs w:val="1"/>
+          <w:rtl w:val="0"/>
+        </w:rPr>
+        <w:t xml:space="preserve">CSS Flexbox</w:t>
+      </w:r>
+      <w:r>
+        <w:rPr>
+          <w:rtl w:val="0"/>
+        </w:rPr>
+        <w:t xml:space="preserve"> - Origamid (jun/2021), </w:t>
+      </w:r>
+      <w:r>
+        <w:rPr>
+          <w:b w:val="1"/>
+          <w:bCs w:val="1"/>
+          <w:rtl w:val="0"/>
+        </w:rPr>
+        <w:t xml:space="preserve">CSS grid Layout</w:t>
+      </w:r>
+      <w:r>
+        <w:rPr>
+          <w:rtl w:val="0"/>
+        </w:rPr>
+        <w:t xml:space="preserve"> - Origamid (jun/2021)</w:t>
       </w:r>
       <w:r>
         <w:rPr>
@@ -1859,121 +1613,8 @@
       </w:rPr>
     </w:lvl>
   </w:abstractNum>
-  <w:abstractNum w:abstractNumId="2">
-    <w:lvl w:ilvl="0">
-      <w:start w:val="1"/>
-      <w:numFmt w:val="bullet"/>
-      <w:lvlText w:val="●"/>
-      <w:lvlJc w:val="left"/>
-      <w:pPr>
-        <w:ind w:left="720" w:hanging="360"/>
-      </w:pPr>
-      <w:rPr>
-        <w:u w:val="none"/>
-      </w:rPr>
-    </w:lvl>
-    <w:lvl w:ilvl="1">
-      <w:start w:val="1"/>
-      <w:numFmt w:val="bullet"/>
-      <w:lvlText w:val="○"/>
-      <w:lvlJc w:val="left"/>
-      <w:pPr>
-        <w:ind w:left="1440" w:hanging="360"/>
-      </w:pPr>
-      <w:rPr>
-        <w:u w:val="none"/>
-      </w:rPr>
-    </w:lvl>
-    <w:lvl w:ilvl="2">
-      <w:start w:val="1"/>
-      <w:numFmt w:val="bullet"/>
-      <w:lvlText w:val="■"/>
-      <w:lvlJc w:val="left"/>
-      <w:pPr>
-        <w:ind w:left="2160" w:hanging="360"/>
-      </w:pPr>
-      <w:rPr>
-        <w:u w:val="none"/>
-      </w:rPr>
-    </w:lvl>
-    <w:lvl w:ilvl="3">
-      <w:start w:val="1"/>
-      <w:numFmt w:val="bullet"/>
-      <w:lvlText w:val="●"/>
-      <w:lvlJc w:val="left"/>
-      <w:pPr>
-        <w:ind w:left="2880" w:hanging="360"/>
-      </w:pPr>
-      <w:rPr>
-        <w:u w:val="none"/>
-      </w:rPr>
-    </w:lvl>
-    <w:lvl w:ilvl="4">
-      <w:start w:val="1"/>
-      <w:numFmt w:val="bullet"/>
-      <w:lvlText w:val="○"/>
-      <w:lvlJc w:val="left"/>
-      <w:pPr>
-        <w:ind w:left="3600" w:hanging="360"/>
-      </w:pPr>
-      <w:rPr>
-        <w:u w:val="none"/>
-      </w:rPr>
-    </w:lvl>
-    <w:lvl w:ilvl="5">
-      <w:start w:val="1"/>
-      <w:numFmt w:val="bullet"/>
-      <w:lvlText w:val="■"/>
-      <w:lvlJc w:val="left"/>
-      <w:pPr>
-        <w:ind w:left="4320" w:hanging="360"/>
-      </w:pPr>
-      <w:rPr>
-        <w:u w:val="none"/>
-      </w:rPr>
-    </w:lvl>
-    <w:lvl w:ilvl="6">
-      <w:start w:val="1"/>
-      <w:numFmt w:val="bullet"/>
-      <w:lvlText w:val="●"/>
-      <w:lvlJc w:val="left"/>
-      <w:pPr>
-        <w:ind w:left="5040" w:hanging="360"/>
-      </w:pPr>
-      <w:rPr>
-        <w:u w:val="none"/>
-      </w:rPr>
-    </w:lvl>
-    <w:lvl w:ilvl="7">
-      <w:start w:val="1"/>
-      <w:numFmt w:val="bullet"/>
-      <w:lvlText w:val="○"/>
-      <w:lvlJc w:val="left"/>
-      <w:pPr>
-        <w:ind w:left="5760" w:hanging="360"/>
-      </w:pPr>
-      <w:rPr>
-        <w:u w:val="none"/>
-      </w:rPr>
-    </w:lvl>
-    <w:lvl w:ilvl="8">
-      <w:start w:val="1"/>
-      <w:numFmt w:val="bullet"/>
-      <w:lvlText w:val="■"/>
-      <w:lvlJc w:val="left"/>
-      <w:pPr>
-        <w:ind w:left="6480" w:hanging="360"/>
-      </w:pPr>
-      <w:rPr>
-        <w:u w:val="none"/>
-      </w:rPr>
-    </w:lvl>
-  </w:abstractNum>
   <w:num w:numId="1">
     <w:abstractNumId w:val="1"/>
-  </w:num>
-  <w:num w:numId="2">
-    <w:abstractNumId w:val="2"/>
   </w:num>
 </w:numbering>
 </file>
@@ -2016,16 +1657,14 @@
     <w:pPr>
       <w:keepNext w:val="1"/>
       <w:keepLines w:val="1"/>
-      <w:pageBreakBefore w:val="0"/>
-      <w:spacing w:after="200" w:before="480" w:line="240" w:lineRule="auto"/>
+      <w:spacing w:before="120" w:line="240" w:lineRule="auto"/>
     </w:pPr>
     <w:rPr>
-      <w:rFonts w:ascii="Proxima Nova" w:cs="Proxima Nova" w:eastAsia="Proxima Nova" w:hAnsi="Proxima Nova"/>
       <w:b w:val="1"/>
       <w:bCs w:val="1"/>
-      <w:color w:val="00ab44"/>
-      <w:sz w:val="28"/>
-      <w:szCs w:val="28"/>
+      <w:color w:val="c18c5d"/>
+      <w:sz w:val="60"/>
+      <w:szCs w:val="60"/>
     </w:rPr>
   </w:style>
   <w:style w:type="paragraph" w:styleId="Heading2">
@@ -2035,16 +1674,14 @@
     <w:pPr>
       <w:keepNext w:val="1"/>
       <w:keepLines w:val="1"/>
-      <w:pageBreakBefore w:val="0"/>
-      <w:spacing w:before="200" w:line="240" w:lineRule="auto"/>
+      <w:spacing w:after="200" w:before="200" w:line="240" w:lineRule="auto"/>
     </w:pPr>
     <w:rPr>
-      <w:rFonts w:ascii="Proxima Nova" w:cs="Proxima Nova" w:eastAsia="Proxima Nova" w:hAnsi="Proxima Nova"/>
       <w:b w:val="1"/>
       <w:bCs w:val="1"/>
-      <w:color w:val="353744"/>
-      <w:sz w:val="24"/>
-      <w:szCs w:val="24"/>
+      <w:color w:val="c18c5d"/>
+      <w:sz w:val="30"/>
+      <w:szCs w:val="30"/>
     </w:rPr>
   </w:style>
   <w:style w:type="paragraph" w:styleId="Heading3">
@@ -2054,14 +1691,13 @@
     <w:pPr>
       <w:keepNext w:val="1"/>
       <w:keepLines w:val="1"/>
-      <w:pageBreakBefore w:val="0"/>
       <w:spacing w:before="200" w:line="240" w:lineRule="auto"/>
     </w:pPr>
     <w:rPr>
-      <w:rFonts w:ascii="Proxima Nova" w:cs="Proxima Nova" w:eastAsia="Proxima Nova" w:hAnsi="Proxima Nova"/>
       <w:b w:val="1"/>
       <w:bCs w:val="1"/>
-      <w:color w:val="353744"/>
+      <w:sz w:val="24"/>
+      <w:szCs w:val="24"/>
     </w:rPr>
   </w:style>
   <w:style w:type="paragraph" w:styleId="Heading4">
@@ -2071,15 +1707,13 @@
     <w:pPr>
       <w:keepNext w:val="1"/>
       <w:keepLines w:val="1"/>
-      <w:pageBreakBefore w:val="0"/>
-      <w:spacing w:after="0" w:before="160" w:lineRule="auto"/>
+      <w:spacing w:line="240" w:lineRule="auto"/>
+      <w:jc w:val="right"/>
     </w:pPr>
     <w:rPr>
-      <w:rFonts w:ascii="Trebuchet MS" w:cs="Trebuchet MS" w:eastAsia="Trebuchet MS" w:hAnsi="Trebuchet MS"/>
       <w:color w:val="666666"/>
-      <w:sz w:val="22"/>
-      <w:szCs w:val="22"/>
-      <w:u w:val="single"/>
+      <w:sz w:val="20"/>
+      <w:szCs w:val="20"/>
     </w:rPr>
   </w:style>
   <w:style w:type="paragraph" w:styleId="Heading5">
@@ -2240,6 +1874,50 @@
     </w:tblStylePr>
   </w:style>
   <w:style w:type="table" w:styleId="Table3">
+    <w:basedOn w:val="TableNormal"/>
+    <w:tblPr>
+      <w:tblStyleRowBandSize w:val="1"/>
+      <w:tblStyleColBandSize w:val="1"/>
+      <w:tblCellMar/>
+    </w:tblPr>
+    <w:tblStylePr w:type="band1Horz">
+      <w:tcPr/>
+    </w:tblStylePr>
+    <w:tblStylePr w:type="band1Vert">
+      <w:tcPr/>
+    </w:tblStylePr>
+    <w:tblStylePr w:type="band2Horz">
+      <w:tcPr/>
+    </w:tblStylePr>
+    <w:tblStylePr w:type="band2Vert">
+      <w:tcPr/>
+    </w:tblStylePr>
+    <w:tblStylePr w:type="firstCol">
+      <w:tcPr/>
+    </w:tblStylePr>
+    <w:tblStylePr w:type="firstRow">
+      <w:tcPr/>
+    </w:tblStylePr>
+    <w:tblStylePr w:type="lastCol">
+      <w:tcPr/>
+    </w:tblStylePr>
+    <w:tblStylePr w:type="lastRow">
+      <w:tcPr/>
+    </w:tblStylePr>
+    <w:tblStylePr w:type="neCell">
+      <w:tcPr/>
+    </w:tblStylePr>
+    <w:tblStylePr w:type="nwCell">
+      <w:tcPr/>
+    </w:tblStylePr>
+    <w:tblStylePr w:type="seCell">
+      <w:tcPr/>
+    </w:tblStylePr>
+    <w:tblStylePr w:type="swCell">
+      <w:tcPr/>
+    </w:tblStylePr>
+  </w:style>
+  <w:style w:type="table" w:styleId="Table4">
     <w:basedOn w:val="TableNormal"/>
     <w:tblPr>
       <w:tblStyleRowBandSize w:val="1"/>

</xml_diff>